<commit_message>
a little bit changes, changed my code logic
</commit_message>
<xml_diff>
--- a/Lab 1/Task 2.docx
+++ b/Lab 1/Task 2.docx
@@ -473,6 +473,14 @@
     </w:p>
     <w:sdt>
       <w:sdtPr>
+        <w:rPr>
+          <w:rFonts w:eastAsiaTheme="minorEastAsia" w:cstheme="minorBidi"/>
+          <w:b w:val="0"/>
+          <w:bCs w:val="0"/>
+          <w:color w:val="202833"/>
+          <w:sz w:val="22"/>
+          <w:szCs w:val="22"/>
+        </w:rPr>
         <w:id w:val="2105617360"/>
         <w:docPartObj>
           <w:docPartGallery w:val="Table of Contents"/>
@@ -481,11 +489,7 @@
       </w:sdtPr>
       <w:sdtEndPr>
         <w:rPr>
-          <w:rFonts w:eastAsiaTheme="minorEastAsia" w:cstheme="minorBidi"/>
           <w:noProof/>
-          <w:color w:val="202833"/>
-          <w:sz w:val="22"/>
-          <w:szCs w:val="22"/>
         </w:rPr>
       </w:sdtEndPr>
       <w:sdtContent>
@@ -522,7 +526,7 @@
           <w:r>
             <w:fldChar w:fldCharType="separate"/>
           </w:r>
-          <w:hyperlink w:anchor="_Toc243666743" w:history="1">
+          <w:hyperlink w:anchor="_Toc243745047" w:history="1">
             <w:r>
               <w:rPr>
                 <w:rStyle w:val="Hyperlink"/>
@@ -549,7 +553,7 @@
                 <w:noProof/>
                 <w:webHidden/>
               </w:rPr>
-              <w:instrText xml:space="preserve"> PAGEREF _Toc243666743 \h </w:instrText>
+              <w:instrText xml:space="preserve"> PAGEREF _Toc243745047 \h </w:instrText>
             </w:r>
             <w:r>
               <w:rPr>
@@ -596,7 +600,7 @@
               <w14:ligatures w14:val="standardContextual"/>
             </w:rPr>
           </w:pPr>
-          <w:hyperlink w:anchor="_Toc243666744" w:history="1">
+          <w:hyperlink w:anchor="_Toc243745048" w:history="1">
             <w:r>
               <w:rPr>
                 <w:rStyle w:val="Hyperlink"/>
@@ -623,7 +627,7 @@
                 <w:noProof/>
                 <w:webHidden/>
               </w:rPr>
-              <w:instrText xml:space="preserve"> PAGEREF _Toc243666744 \h </w:instrText>
+              <w:instrText xml:space="preserve"> PAGEREF _Toc243745048 \h </w:instrText>
             </w:r>
             <w:r>
               <w:rPr>
@@ -670,7 +674,7 @@
               <w14:ligatures w14:val="standardContextual"/>
             </w:rPr>
           </w:pPr>
-          <w:hyperlink w:anchor="_Toc243666745" w:history="1">
+          <w:hyperlink w:anchor="_Toc243745049" w:history="1">
             <w:r>
               <w:rPr>
                 <w:rStyle w:val="Hyperlink"/>
@@ -697,7 +701,7 @@
                 <w:noProof/>
                 <w:webHidden/>
               </w:rPr>
-              <w:instrText xml:space="preserve"> PAGEREF _Toc243666745 \h </w:instrText>
+              <w:instrText xml:space="preserve"> PAGEREF _Toc243745049 \h </w:instrText>
             </w:r>
             <w:r>
               <w:rPr>
@@ -768,7 +772,7 @@
       <w:pPr>
         <w:pStyle w:val="Heading1"/>
       </w:pPr>
-      <w:bookmarkStart w:id="0" w:name="_Toc243666743"/>
+      <w:bookmarkStart w:id="0" w:name="_Toc243745047"/>
       <w:r>
         <w:lastRenderedPageBreak/>
         <w:t>Rule-Based Scholarship Example</w:t>
@@ -776,10 +780,15 @@
       <w:bookmarkEnd w:id="0"/>
     </w:p>
     <w:p>
+      <w:r>
+        <w:t>This example checks scholarship applications with simple rules. Each application is checked against four rules, and the result is either Review or Hold. All the numbers used in the rules (score 70, 2 projects and 7 days) are made-up values for this lab. They are not real scholarship rules.</w:t>
+      </w:r>
+    </w:p>
+    <w:p>
       <w:pPr>
         <w:pStyle w:val="Heading2"/>
       </w:pPr>
-      <w:bookmarkStart w:id="1" w:name="_Toc243666744"/>
+      <w:bookmarkStart w:id="1" w:name="_Toc243745048"/>
       <w:r>
         <w:t>What is happening in the code</w:t>
       </w:r>
@@ -789,7 +798,7 @@
       <w:pPr>
         <w:numPr>
           <w:ilvl w:val="0"/>
-          <w:numId w:val="21"/>
+          <w:numId w:val="24"/>
         </w:numPr>
       </w:pPr>
       <w:r>
@@ -797,17 +806,17 @@
           <w:b/>
           <w:bCs/>
         </w:rPr>
-        <w:t>The function checkScholarship:</w:t>
+        <w:t>The function checkApplication:</w:t>
       </w:r>
       <w:r>
-        <w:t xml:space="preserve"> It takes four inputs and checks the rules one by one. The first rule that fails gives “Hold” with the reason. If none fail, it gives “Review”.</w:t>
+        <w:t xml:space="preserve"> It takes four inputs: score, documents, projects and days. It checks every rule and saves each failed rule in a list called problems. If the list is empty, it gives “Review”. If not, it gives “Hold” with all the reasons joined together.</w:t>
       </w:r>
     </w:p>
     <w:p>
       <w:pPr>
         <w:numPr>
           <w:ilvl w:val="0"/>
-          <w:numId w:val="21"/>
+          <w:numId w:val="24"/>
         </w:numPr>
       </w:pPr>
       <w:r>
@@ -815,17 +824,17 @@
           <w:b/>
           <w:bCs/>
         </w:rPr>
-        <w:t>Two new conditions:</w:t>
+        <w:t>The rules:</w:t>
       </w:r>
       <w:r>
-        <w:t xml:space="preserve"> attendancePercent (at least 75) and enrollmentVerified (must be True). The old rules, score ≥ 70 and documents complete, stay.</w:t>
+        <w:t xml:space="preserve"> The score must be at least 70, the documents must be present, the applicant must have at least 2 academic projects, and the application must be submitted within 7 days.</w:t>
       </w:r>
     </w:p>
     <w:p>
       <w:pPr>
         <w:numPr>
           <w:ilvl w:val="0"/>
-          <w:numId w:val="21"/>
+          <w:numId w:val="24"/>
         </w:numPr>
       </w:pPr>
       <w:r>
@@ -833,17 +842,25 @@
           <w:b/>
           <w:bCs/>
         </w:rPr>
-        <w:t>testCases:</w:t>
+        <w:t>applications:</w:t>
       </w:r>
       <w:r>
-        <w:t xml:space="preserve"> A list with four cases. Each has the input values and the result we expect.</w:t>
+        <w:t xml:space="preserve"> A list with four cases. Each case has the </w:t>
+      </w:r>
+      <w:proofErr w:type="gramStart"/>
+      <w:r>
+        <w:t>student</w:t>
+      </w:r>
+      <w:proofErr w:type="gramEnd"/>
+      <w:r>
+        <w:t xml:space="preserve"> name, the input values and the result we expect.</w:t>
       </w:r>
     </w:p>
     <w:p>
       <w:pPr>
         <w:numPr>
           <w:ilvl w:val="0"/>
-          <w:numId w:val="21"/>
+          <w:numId w:val="24"/>
         </w:numPr>
       </w:pPr>
       <w:r>
@@ -854,14 +871,22 @@
         <w:t>The loop:</w:t>
       </w:r>
       <w:r>
-        <w:t xml:space="preserve"> It runs each case through the function, then prints the case name, the input, the expected result, the actual result and the reason.</w:t>
+        <w:t xml:space="preserve"> It runs each case through the function, then prints the </w:t>
+      </w:r>
+      <w:proofErr w:type="gramStart"/>
+      <w:r>
+        <w:t>applicant</w:t>
+      </w:r>
+      <w:proofErr w:type="gramEnd"/>
+      <w:r>
+        <w:t xml:space="preserve"> name, the input, the expected result, the actual result and the reason. The last line, Test passed, shows True if the expected and actual results are the same.</w:t>
       </w:r>
     </w:p>
     <w:p>
       <w:pPr>
         <w:pStyle w:val="Heading2"/>
       </w:pPr>
-      <w:bookmarkStart w:id="2" w:name="_Toc243666745"/>
+      <w:bookmarkStart w:id="2" w:name="_Toc243745049"/>
       <w:r>
         <w:t>How I selected the four test cases</w:t>
       </w:r>
@@ -869,50 +894,74 @@
     </w:p>
     <w:p>
       <w:pPr>
-        <w:pStyle w:val="ListParagraph"/>
         <w:numPr>
           <w:ilvl w:val="0"/>
-          <w:numId w:val="23"/>
+          <w:numId w:val="25"/>
         </w:numPr>
       </w:pPr>
       <w:r>
-        <w:t>Case 1 is a normal pass where everything is correct.</w:t>
+        <w:rPr>
+          <w:b/>
+          <w:bCs/>
+        </w:rPr>
+        <w:t>Case 1 (Student A)</w:t>
+      </w:r>
+      <w:r>
+        <w:t xml:space="preserve"> is a normal pass where everything is correct.</w:t>
       </w:r>
     </w:p>
     <w:p>
       <w:pPr>
-        <w:pStyle w:val="ListParagraph"/>
         <w:numPr>
           <w:ilvl w:val="0"/>
-          <w:numId w:val="23"/>
+          <w:numId w:val="25"/>
         </w:numPr>
       </w:pPr>
       <w:r>
-        <w:t>Case 2 fails only the attendance condition.</w:t>
+        <w:rPr>
+          <w:b/>
+          <w:bCs/>
+        </w:rPr>
+        <w:t>Case 2 (Student B)</w:t>
+      </w:r>
+      <w:r>
+        <w:t xml:space="preserve"> fails only the academic projects rule, because the student has only 1 project.</w:t>
       </w:r>
     </w:p>
     <w:p>
       <w:pPr>
-        <w:pStyle w:val="ListParagraph"/>
         <w:numPr>
           <w:ilvl w:val="0"/>
-          <w:numId w:val="23"/>
+          <w:numId w:val="25"/>
         </w:numPr>
       </w:pPr>
       <w:r>
-        <w:t>Case 3 fails only the enrollment condition.</w:t>
+        <w:rPr>
+          <w:b/>
+          <w:bCs/>
+        </w:rPr>
+        <w:t>Case 3 (Student C)</w:t>
+      </w:r>
+      <w:r>
+        <w:t xml:space="preserve"> fails only the late submission rule, because the application came after 9 days.</w:t>
       </w:r>
     </w:p>
     <w:p>
       <w:pPr>
-        <w:pStyle w:val="ListParagraph"/>
         <w:numPr>
           <w:ilvl w:val="0"/>
-          <w:numId w:val="23"/>
+          <w:numId w:val="25"/>
         </w:numPr>
       </w:pPr>
       <w:r>
-        <w:t>Case 4 uses a score of exactly 70 and attendance of exactly 75, to test the boundary.</w:t>
+        <w:rPr>
+          <w:b/>
+          <w:bCs/>
+        </w:rPr>
+        <w:t>Case 4 (Student D)</w:t>
+      </w:r>
+      <w:r>
+        <w:t xml:space="preserve"> uses a score of exactly 70, exactly 2 projects and exactly 7 days, to test the boundary. All three are on the limit, and the application still passes.</w:t>
       </w:r>
     </w:p>
     <w:p/>
@@ -1332,6 +1381,155 @@
     </w:lvl>
   </w:abstractNum>
   <w:abstractNum w:abstractNumId="10" w15:restartNumberingAfterBreak="0">
+    <w:nsid w:val="0516481B"/>
+    <w:multiLevelType w:val="multilevel"/>
+    <w:tmpl w:val="E856AF52"/>
+    <w:lvl w:ilvl="0">
+      <w:start w:val="1"/>
+      <w:numFmt w:val="bullet"/>
+      <w:lvlText w:val=""/>
+      <w:lvlJc w:val="left"/>
+      <w:pPr>
+        <w:tabs>
+          <w:tab w:val="num" w:pos="720"/>
+        </w:tabs>
+        <w:ind w:left="720" w:hanging="360"/>
+      </w:pPr>
+      <w:rPr>
+        <w:rFonts w:ascii="Symbol" w:hAnsi="Symbol" w:hint="default"/>
+        <w:sz w:val="20"/>
+      </w:rPr>
+    </w:lvl>
+    <w:lvl w:ilvl="1" w:tentative="1">
+      <w:start w:val="1"/>
+      <w:numFmt w:val="bullet"/>
+      <w:lvlText w:val="o"/>
+      <w:lvlJc w:val="left"/>
+      <w:pPr>
+        <w:tabs>
+          <w:tab w:val="num" w:pos="1440"/>
+        </w:tabs>
+        <w:ind w:left="1440" w:hanging="360"/>
+      </w:pPr>
+      <w:rPr>
+        <w:rFonts w:ascii="Courier New" w:hAnsi="Courier New" w:hint="default"/>
+        <w:sz w:val="20"/>
+      </w:rPr>
+    </w:lvl>
+    <w:lvl w:ilvl="2" w:tentative="1">
+      <w:start w:val="1"/>
+      <w:numFmt w:val="bullet"/>
+      <w:lvlText w:val=""/>
+      <w:lvlJc w:val="left"/>
+      <w:pPr>
+        <w:tabs>
+          <w:tab w:val="num" w:pos="2160"/>
+        </w:tabs>
+        <w:ind w:left="2160" w:hanging="360"/>
+      </w:pPr>
+      <w:rPr>
+        <w:rFonts w:ascii="Wingdings" w:hAnsi="Wingdings" w:hint="default"/>
+        <w:sz w:val="20"/>
+      </w:rPr>
+    </w:lvl>
+    <w:lvl w:ilvl="3" w:tentative="1">
+      <w:start w:val="1"/>
+      <w:numFmt w:val="bullet"/>
+      <w:lvlText w:val=""/>
+      <w:lvlJc w:val="left"/>
+      <w:pPr>
+        <w:tabs>
+          <w:tab w:val="num" w:pos="2880"/>
+        </w:tabs>
+        <w:ind w:left="2880" w:hanging="360"/>
+      </w:pPr>
+      <w:rPr>
+        <w:rFonts w:ascii="Wingdings" w:hAnsi="Wingdings" w:hint="default"/>
+        <w:sz w:val="20"/>
+      </w:rPr>
+    </w:lvl>
+    <w:lvl w:ilvl="4" w:tentative="1">
+      <w:start w:val="1"/>
+      <w:numFmt w:val="bullet"/>
+      <w:lvlText w:val=""/>
+      <w:lvlJc w:val="left"/>
+      <w:pPr>
+        <w:tabs>
+          <w:tab w:val="num" w:pos="3600"/>
+        </w:tabs>
+        <w:ind w:left="3600" w:hanging="360"/>
+      </w:pPr>
+      <w:rPr>
+        <w:rFonts w:ascii="Wingdings" w:hAnsi="Wingdings" w:hint="default"/>
+        <w:sz w:val="20"/>
+      </w:rPr>
+    </w:lvl>
+    <w:lvl w:ilvl="5" w:tentative="1">
+      <w:start w:val="1"/>
+      <w:numFmt w:val="bullet"/>
+      <w:lvlText w:val=""/>
+      <w:lvlJc w:val="left"/>
+      <w:pPr>
+        <w:tabs>
+          <w:tab w:val="num" w:pos="4320"/>
+        </w:tabs>
+        <w:ind w:left="4320" w:hanging="360"/>
+      </w:pPr>
+      <w:rPr>
+        <w:rFonts w:ascii="Wingdings" w:hAnsi="Wingdings" w:hint="default"/>
+        <w:sz w:val="20"/>
+      </w:rPr>
+    </w:lvl>
+    <w:lvl w:ilvl="6" w:tentative="1">
+      <w:start w:val="1"/>
+      <w:numFmt w:val="bullet"/>
+      <w:lvlText w:val=""/>
+      <w:lvlJc w:val="left"/>
+      <w:pPr>
+        <w:tabs>
+          <w:tab w:val="num" w:pos="5040"/>
+        </w:tabs>
+        <w:ind w:left="5040" w:hanging="360"/>
+      </w:pPr>
+      <w:rPr>
+        <w:rFonts w:ascii="Wingdings" w:hAnsi="Wingdings" w:hint="default"/>
+        <w:sz w:val="20"/>
+      </w:rPr>
+    </w:lvl>
+    <w:lvl w:ilvl="7" w:tentative="1">
+      <w:start w:val="1"/>
+      <w:numFmt w:val="bullet"/>
+      <w:lvlText w:val=""/>
+      <w:lvlJc w:val="left"/>
+      <w:pPr>
+        <w:tabs>
+          <w:tab w:val="num" w:pos="5760"/>
+        </w:tabs>
+        <w:ind w:left="5760" w:hanging="360"/>
+      </w:pPr>
+      <w:rPr>
+        <w:rFonts w:ascii="Wingdings" w:hAnsi="Wingdings" w:hint="default"/>
+        <w:sz w:val="20"/>
+      </w:rPr>
+    </w:lvl>
+    <w:lvl w:ilvl="8" w:tentative="1">
+      <w:start w:val="1"/>
+      <w:numFmt w:val="bullet"/>
+      <w:lvlText w:val=""/>
+      <w:lvlJc w:val="left"/>
+      <w:pPr>
+        <w:tabs>
+          <w:tab w:val="num" w:pos="6480"/>
+        </w:tabs>
+        <w:ind w:left="6480" w:hanging="360"/>
+      </w:pPr>
+      <w:rPr>
+        <w:rFonts w:ascii="Wingdings" w:hAnsi="Wingdings" w:hint="default"/>
+        <w:sz w:val="20"/>
+      </w:rPr>
+    </w:lvl>
+  </w:abstractNum>
+  <w:abstractNum w:abstractNumId="11" w15:restartNumberingAfterBreak="0">
     <w:nsid w:val="10CD3025"/>
     <w:multiLevelType w:val="hybridMultilevel"/>
     <w:tmpl w:val="82D48F86"/>
@@ -1444,7 +1642,7 @@
       </w:rPr>
     </w:lvl>
   </w:abstractNum>
-  <w:abstractNum w:abstractNumId="11" w15:restartNumberingAfterBreak="0">
+  <w:abstractNum w:abstractNumId="12" w15:restartNumberingAfterBreak="0">
     <w:nsid w:val="1F69311F"/>
     <w:multiLevelType w:val="multilevel"/>
     <w:tmpl w:val="CD0829FE"/>
@@ -1560,7 +1758,7 @@
       </w:pPr>
     </w:lvl>
   </w:abstractNum>
-  <w:abstractNum w:abstractNumId="12" w15:restartNumberingAfterBreak="0">
+  <w:abstractNum w:abstractNumId="13" w15:restartNumberingAfterBreak="0">
     <w:nsid w:val="20627DF0"/>
     <w:multiLevelType w:val="multilevel"/>
     <w:tmpl w:val="5746AA50"/>
@@ -1673,7 +1871,7 @@
       </w:pPr>
     </w:lvl>
   </w:abstractNum>
-  <w:abstractNum w:abstractNumId="13" w15:restartNumberingAfterBreak="0">
+  <w:abstractNum w:abstractNumId="14" w15:restartNumberingAfterBreak="0">
     <w:nsid w:val="2DB24D16"/>
     <w:multiLevelType w:val="multilevel"/>
     <w:tmpl w:val="1944A424"/>
@@ -1786,7 +1984,7 @@
       </w:pPr>
     </w:lvl>
   </w:abstractNum>
-  <w:abstractNum w:abstractNumId="14" w15:restartNumberingAfterBreak="0">
+  <w:abstractNum w:abstractNumId="15" w15:restartNumberingAfterBreak="0">
     <w:nsid w:val="362B6139"/>
     <w:multiLevelType w:val="multilevel"/>
     <w:tmpl w:val="3842C8EA"/>
@@ -1935,7 +2133,7 @@
       </w:rPr>
     </w:lvl>
   </w:abstractNum>
-  <w:abstractNum w:abstractNumId="15" w15:restartNumberingAfterBreak="0">
+  <w:abstractNum w:abstractNumId="16" w15:restartNumberingAfterBreak="0">
     <w:nsid w:val="39C85A49"/>
     <w:multiLevelType w:val="hybridMultilevel"/>
     <w:tmpl w:val="CEECB67C"/>
@@ -2048,7 +2246,7 @@
       </w:rPr>
     </w:lvl>
   </w:abstractNum>
-  <w:abstractNum w:abstractNumId="16" w15:restartNumberingAfterBreak="0">
+  <w:abstractNum w:abstractNumId="17" w15:restartNumberingAfterBreak="0">
     <w:nsid w:val="3E644CBD"/>
     <w:multiLevelType w:val="multilevel"/>
     <w:tmpl w:val="5C8A7A16"/>
@@ -2161,7 +2359,7 @@
       </w:pPr>
     </w:lvl>
   </w:abstractNum>
-  <w:abstractNum w:abstractNumId="17" w15:restartNumberingAfterBreak="0">
+  <w:abstractNum w:abstractNumId="18" w15:restartNumberingAfterBreak="0">
     <w:nsid w:val="4AD339C6"/>
     <w:multiLevelType w:val="hybridMultilevel"/>
     <w:tmpl w:val="1F543726"/>
@@ -2274,7 +2472,156 @@
       </w:rPr>
     </w:lvl>
   </w:abstractNum>
-  <w:abstractNum w:abstractNumId="18" w15:restartNumberingAfterBreak="0">
+  <w:abstractNum w:abstractNumId="19" w15:restartNumberingAfterBreak="0">
+    <w:nsid w:val="4D5F7A24"/>
+    <w:multiLevelType w:val="multilevel"/>
+    <w:tmpl w:val="FCE0BCF8"/>
+    <w:lvl w:ilvl="0">
+      <w:start w:val="1"/>
+      <w:numFmt w:val="bullet"/>
+      <w:lvlText w:val=""/>
+      <w:lvlJc w:val="left"/>
+      <w:pPr>
+        <w:tabs>
+          <w:tab w:val="num" w:pos="720"/>
+        </w:tabs>
+        <w:ind w:left="720" w:hanging="360"/>
+      </w:pPr>
+      <w:rPr>
+        <w:rFonts w:ascii="Symbol" w:hAnsi="Symbol" w:hint="default"/>
+        <w:sz w:val="20"/>
+      </w:rPr>
+    </w:lvl>
+    <w:lvl w:ilvl="1" w:tentative="1">
+      <w:start w:val="1"/>
+      <w:numFmt w:val="bullet"/>
+      <w:lvlText w:val="o"/>
+      <w:lvlJc w:val="left"/>
+      <w:pPr>
+        <w:tabs>
+          <w:tab w:val="num" w:pos="1440"/>
+        </w:tabs>
+        <w:ind w:left="1440" w:hanging="360"/>
+      </w:pPr>
+      <w:rPr>
+        <w:rFonts w:ascii="Courier New" w:hAnsi="Courier New" w:hint="default"/>
+        <w:sz w:val="20"/>
+      </w:rPr>
+    </w:lvl>
+    <w:lvl w:ilvl="2" w:tentative="1">
+      <w:start w:val="1"/>
+      <w:numFmt w:val="bullet"/>
+      <w:lvlText w:val=""/>
+      <w:lvlJc w:val="left"/>
+      <w:pPr>
+        <w:tabs>
+          <w:tab w:val="num" w:pos="2160"/>
+        </w:tabs>
+        <w:ind w:left="2160" w:hanging="360"/>
+      </w:pPr>
+      <w:rPr>
+        <w:rFonts w:ascii="Wingdings" w:hAnsi="Wingdings" w:hint="default"/>
+        <w:sz w:val="20"/>
+      </w:rPr>
+    </w:lvl>
+    <w:lvl w:ilvl="3" w:tentative="1">
+      <w:start w:val="1"/>
+      <w:numFmt w:val="bullet"/>
+      <w:lvlText w:val=""/>
+      <w:lvlJc w:val="left"/>
+      <w:pPr>
+        <w:tabs>
+          <w:tab w:val="num" w:pos="2880"/>
+        </w:tabs>
+        <w:ind w:left="2880" w:hanging="360"/>
+      </w:pPr>
+      <w:rPr>
+        <w:rFonts w:ascii="Wingdings" w:hAnsi="Wingdings" w:hint="default"/>
+        <w:sz w:val="20"/>
+      </w:rPr>
+    </w:lvl>
+    <w:lvl w:ilvl="4" w:tentative="1">
+      <w:start w:val="1"/>
+      <w:numFmt w:val="bullet"/>
+      <w:lvlText w:val=""/>
+      <w:lvlJc w:val="left"/>
+      <w:pPr>
+        <w:tabs>
+          <w:tab w:val="num" w:pos="3600"/>
+        </w:tabs>
+        <w:ind w:left="3600" w:hanging="360"/>
+      </w:pPr>
+      <w:rPr>
+        <w:rFonts w:ascii="Wingdings" w:hAnsi="Wingdings" w:hint="default"/>
+        <w:sz w:val="20"/>
+      </w:rPr>
+    </w:lvl>
+    <w:lvl w:ilvl="5" w:tentative="1">
+      <w:start w:val="1"/>
+      <w:numFmt w:val="bullet"/>
+      <w:lvlText w:val=""/>
+      <w:lvlJc w:val="left"/>
+      <w:pPr>
+        <w:tabs>
+          <w:tab w:val="num" w:pos="4320"/>
+        </w:tabs>
+        <w:ind w:left="4320" w:hanging="360"/>
+      </w:pPr>
+      <w:rPr>
+        <w:rFonts w:ascii="Wingdings" w:hAnsi="Wingdings" w:hint="default"/>
+        <w:sz w:val="20"/>
+      </w:rPr>
+    </w:lvl>
+    <w:lvl w:ilvl="6" w:tentative="1">
+      <w:start w:val="1"/>
+      <w:numFmt w:val="bullet"/>
+      <w:lvlText w:val=""/>
+      <w:lvlJc w:val="left"/>
+      <w:pPr>
+        <w:tabs>
+          <w:tab w:val="num" w:pos="5040"/>
+        </w:tabs>
+        <w:ind w:left="5040" w:hanging="360"/>
+      </w:pPr>
+      <w:rPr>
+        <w:rFonts w:ascii="Wingdings" w:hAnsi="Wingdings" w:hint="default"/>
+        <w:sz w:val="20"/>
+      </w:rPr>
+    </w:lvl>
+    <w:lvl w:ilvl="7" w:tentative="1">
+      <w:start w:val="1"/>
+      <w:numFmt w:val="bullet"/>
+      <w:lvlText w:val=""/>
+      <w:lvlJc w:val="left"/>
+      <w:pPr>
+        <w:tabs>
+          <w:tab w:val="num" w:pos="5760"/>
+        </w:tabs>
+        <w:ind w:left="5760" w:hanging="360"/>
+      </w:pPr>
+      <w:rPr>
+        <w:rFonts w:ascii="Wingdings" w:hAnsi="Wingdings" w:hint="default"/>
+        <w:sz w:val="20"/>
+      </w:rPr>
+    </w:lvl>
+    <w:lvl w:ilvl="8" w:tentative="1">
+      <w:start w:val="1"/>
+      <w:numFmt w:val="bullet"/>
+      <w:lvlText w:val=""/>
+      <w:lvlJc w:val="left"/>
+      <w:pPr>
+        <w:tabs>
+          <w:tab w:val="num" w:pos="6480"/>
+        </w:tabs>
+        <w:ind w:left="6480" w:hanging="360"/>
+      </w:pPr>
+      <w:rPr>
+        <w:rFonts w:ascii="Wingdings" w:hAnsi="Wingdings" w:hint="default"/>
+        <w:sz w:val="20"/>
+      </w:rPr>
+    </w:lvl>
+  </w:abstractNum>
+  <w:abstractNum w:abstractNumId="20" w15:restartNumberingAfterBreak="0">
     <w:nsid w:val="4F1A61BB"/>
     <w:multiLevelType w:val="multilevel"/>
     <w:tmpl w:val="080C1C02"/>
@@ -2423,7 +2770,7 @@
       </w:rPr>
     </w:lvl>
   </w:abstractNum>
-  <w:abstractNum w:abstractNumId="19" w15:restartNumberingAfterBreak="0">
+  <w:abstractNum w:abstractNumId="21" w15:restartNumberingAfterBreak="0">
     <w:nsid w:val="6599693A"/>
     <w:multiLevelType w:val="hybridMultilevel"/>
     <w:tmpl w:val="4EEE67BA"/>
@@ -2536,7 +2883,7 @@
       </w:rPr>
     </w:lvl>
   </w:abstractNum>
-  <w:abstractNum w:abstractNumId="20" w15:restartNumberingAfterBreak="0">
+  <w:abstractNum w:abstractNumId="22" w15:restartNumberingAfterBreak="0">
     <w:nsid w:val="6EFD2D3F"/>
     <w:multiLevelType w:val="multilevel"/>
     <w:tmpl w:val="1C0C73A0"/>
@@ -2685,7 +3032,7 @@
       </w:rPr>
     </w:lvl>
   </w:abstractNum>
-  <w:abstractNum w:abstractNumId="21" w15:restartNumberingAfterBreak="0">
+  <w:abstractNum w:abstractNumId="23" w15:restartNumberingAfterBreak="0">
     <w:nsid w:val="7A141DAF"/>
     <w:multiLevelType w:val="multilevel"/>
     <w:tmpl w:val="CD0829FE"/>
@@ -2801,7 +3148,7 @@
       </w:pPr>
     </w:lvl>
   </w:abstractNum>
-  <w:abstractNum w:abstractNumId="22" w15:restartNumberingAfterBreak="0">
+  <w:abstractNum w:abstractNumId="24" w15:restartNumberingAfterBreak="0">
     <w:nsid w:val="7E850D1E"/>
     <w:multiLevelType w:val="multilevel"/>
     <w:tmpl w:val="E9CE30F6"/>
@@ -2978,46 +3325,52 @@
     <w:abstractNumId w:val="0"/>
   </w:num>
   <w:num w:numId="10" w16cid:durableId="327514269">
-    <w:abstractNumId w:val="16"/>
+    <w:abstractNumId w:val="17"/>
   </w:num>
   <w:num w:numId="11" w16cid:durableId="962729527">
-    <w:abstractNumId w:val="14"/>
+    <w:abstractNumId w:val="15"/>
   </w:num>
   <w:num w:numId="12" w16cid:durableId="594485959">
-    <w:abstractNumId w:val="20"/>
+    <w:abstractNumId w:val="22"/>
   </w:num>
   <w:num w:numId="13" w16cid:durableId="611673845">
-    <w:abstractNumId w:val="12"/>
+    <w:abstractNumId w:val="13"/>
   </w:num>
   <w:num w:numId="14" w16cid:durableId="1380281807">
     <w:abstractNumId w:val="9"/>
   </w:num>
   <w:num w:numId="15" w16cid:durableId="1800415768">
-    <w:abstractNumId w:val="22"/>
+    <w:abstractNumId w:val="24"/>
   </w:num>
   <w:num w:numId="16" w16cid:durableId="847526328">
+    <w:abstractNumId w:val="11"/>
+  </w:num>
+  <w:num w:numId="17" w16cid:durableId="2137485794">
+    <w:abstractNumId w:val="16"/>
+  </w:num>
+  <w:num w:numId="18" w16cid:durableId="611866578">
+    <w:abstractNumId w:val="21"/>
+  </w:num>
+  <w:num w:numId="19" w16cid:durableId="355541946">
+    <w:abstractNumId w:val="18"/>
+  </w:num>
+  <w:num w:numId="20" w16cid:durableId="1421483327">
+    <w:abstractNumId w:val="14"/>
+  </w:num>
+  <w:num w:numId="21" w16cid:durableId="1836413478">
+    <w:abstractNumId w:val="23"/>
+  </w:num>
+  <w:num w:numId="22" w16cid:durableId="1792085934">
+    <w:abstractNumId w:val="20"/>
+  </w:num>
+  <w:num w:numId="23" w16cid:durableId="526715434">
+    <w:abstractNumId w:val="12"/>
+  </w:num>
+  <w:num w:numId="24" w16cid:durableId="1044869876">
     <w:abstractNumId w:val="10"/>
   </w:num>
-  <w:num w:numId="17" w16cid:durableId="2137485794">
-    <w:abstractNumId w:val="15"/>
-  </w:num>
-  <w:num w:numId="18" w16cid:durableId="611866578">
+  <w:num w:numId="25" w16cid:durableId="36975528">
     <w:abstractNumId w:val="19"/>
-  </w:num>
-  <w:num w:numId="19" w16cid:durableId="355541946">
-    <w:abstractNumId w:val="17"/>
-  </w:num>
-  <w:num w:numId="20" w16cid:durableId="1421483327">
-    <w:abstractNumId w:val="13"/>
-  </w:num>
-  <w:num w:numId="21" w16cid:durableId="1836413478">
-    <w:abstractNumId w:val="21"/>
-  </w:num>
-  <w:num w:numId="22" w16cid:durableId="1792085934">
-    <w:abstractNumId w:val="18"/>
-  </w:num>
-  <w:num w:numId="23" w16cid:durableId="526715434">
-    <w:abstractNumId w:val="11"/>
   </w:num>
 </w:numbering>
 </file>

</xml_diff>